<commit_message>
Fixed an issue with RDM
</commit_message>
<xml_diff>
--- a/flower_backend/doctypes/RDM.docx
+++ b/flower_backend/doctypes/RDM.docx
@@ -1544,8 +1544,6 @@
         </w:rPr>
         <w:t>. L’étudiant devra ainsi fournir, à terme, le livrable décrit ainsi :</w:t>
       </w:r>
-      <w:bookmarkStart w:id="1" w:name="_GoBack"/>
-      <w:bookmarkEnd w:id="1"/>
     </w:p>
     <w:p>
       <w:pPr>
@@ -2340,8 +2338,9 @@
           <w:sz w:val="20"/>
           <w:szCs w:val="20"/>
         </w:rPr>
-        <w:t>gross</w:t>
-      </w:r>
+        <w:t>remunerationRaw</w:t>
+      </w:r>
+      <w:proofErr w:type="spellEnd"/>
       <w:r>
         <w:rPr>
           <w:rFonts w:ascii="Arial" w:eastAsia="Arial" w:hAnsi="Arial" w:cs="Arial"/>
@@ -2349,16 +2348,6 @@
           <w:sz w:val="20"/>
           <w:szCs w:val="20"/>
         </w:rPr>
-        <w:t>Remuneration</w:t>
-      </w:r>
-      <w:proofErr w:type="spellEnd"/>
-      <w:r>
-        <w:rPr>
-          <w:rFonts w:ascii="Arial" w:eastAsia="Arial" w:hAnsi="Arial" w:cs="Arial"/>
-          <w:color w:val="021A32"/>
-          <w:sz w:val="20"/>
-          <w:szCs w:val="20"/>
-        </w:rPr>
         <w:t xml:space="preserve"> }}</w:t>
       </w:r>
       <w:r>
@@ -2376,9 +2365,8 @@
           <w:sz w:val="20"/>
           <w:szCs w:val="20"/>
         </w:rPr>
-        <w:t xml:space="preserve">{{ </w:t>
-      </w:r>
-      <w:proofErr w:type="spellStart"/>
+        <w:t>{{ mission.</w:t>
+      </w:r>
       <w:r>
         <w:rPr>
           <w:rFonts w:ascii="Arial" w:eastAsia="Arial" w:hAnsi="Arial" w:cs="Arial"/>
@@ -2386,27 +2374,10 @@
           <w:sz w:val="20"/>
           <w:szCs w:val="20"/>
         </w:rPr>
-        <w:t>mission.</w:t>
-      </w:r>
-      <w:r>
-        <w:rPr>
-          <w:rFonts w:ascii="Arial" w:eastAsia="Arial" w:hAnsi="Arial" w:cs="Arial"/>
-          <w:color w:val="FF0000"/>
-          <w:sz w:val="20"/>
-          <w:szCs w:val="20"/>
-        </w:rPr>
-        <w:t>gross</w:t>
-      </w:r>
-      <w:r>
-        <w:rPr>
-          <w:rFonts w:ascii="Arial" w:eastAsia="Arial" w:hAnsi="Arial" w:cs="Arial"/>
-          <w:color w:val="FF0000"/>
-          <w:sz w:val="20"/>
-          <w:szCs w:val="20"/>
-        </w:rPr>
-        <w:t>Remuneration</w:t>
-      </w:r>
-      <w:proofErr w:type="spellEnd"/>
+        <w:t>remunerationRaw</w:t>
+      </w:r>
+      <w:bookmarkStart w:id="1" w:name="_GoBack"/>
+      <w:bookmarkEnd w:id="1"/>
       <w:r>
         <w:rPr>
           <w:rFonts w:ascii="Arial" w:eastAsia="Arial" w:hAnsi="Arial" w:cs="Arial"/>
@@ -4427,7 +4398,7 @@
         <w:sz w:val="16"/>
         <w:szCs w:val="16"/>
       </w:rPr>
-      <w:t>2</w:t>
+      <w:t>3</w:t>
     </w:r>
     <w:r>
       <w:rPr>

</xml_diff>